<commit_message>
refactor(site): simplify academic pages with BNU blue
</commit_message>
<xml_diff>
--- a/assets/tianci-gu-cv.docx
+++ b/assets/tianci-gu-cv.docx
@@ -211,38 +211,34 @@
           <w:sz w:val="20"/>
           <w:szCs w:val="20"/>
         </w:rPr>
-        <w:t>gutc@cug.edu.cn |</w:t>
-      </w:r>
-      <w:r>
-        <w:rPr>
-          <w:rFonts w:ascii="Times New Roman" w:eastAsia="楷体" w:hAnsi="Times New Roman" w:cs="Times New Roman" w:hint="eastAsia"/>
+        <w:t>gutc@</w:t>
+      </w:r>
+      <w:r>
+        <w:rPr>
+          <w:rFonts w:ascii="Times New Roman" w:eastAsia="楷体" w:hAnsi="Times New Roman" w:cs="Times New Roman"/>
           <w:kern w:val="0"/>
           <w:sz w:val="20"/>
           <w:szCs w:val="20"/>
         </w:rPr>
-        <w:t xml:space="preserve"> </w:t>
-      </w:r>
-      <w:r>
-        <w:rPr>
-          <w:rFonts w:ascii="Times New Roman" w:eastAsia="楷体" w:hAnsi="Times New Roman" w:cs="Times New Roman" w:hint="eastAsia"/>
-          <w:b/>
-          <w:bCs/>
+        <w:t>mail.bnu</w:t>
+      </w:r>
+      <w:r>
+        <w:rPr>
+          <w:rFonts w:ascii="Times New Roman" w:eastAsia="楷体" w:hAnsi="Times New Roman" w:cs="Times New Roman"/>
           <w:kern w:val="0"/>
           <w:sz w:val="20"/>
           <w:szCs w:val="20"/>
         </w:rPr>
-        <w:t>导师</w:t>
-      </w:r>
-      <w:r>
-        <w:rPr>
-          <w:rFonts w:ascii="Times New Roman" w:eastAsia="楷体" w:hAnsi="Times New Roman" w:cs="Times New Roman" w:hint="eastAsia"/>
-          <w:b/>
-          <w:bCs/>
+        <w:t>.edu.cn |</w:t>
+      </w:r>
+      <w:r>
+        <w:rPr>
+          <w:rFonts w:ascii="Times New Roman" w:eastAsia="楷体" w:hAnsi="Times New Roman" w:cs="Times New Roman" w:hint="eastAsia"/>
           <w:kern w:val="0"/>
           <w:sz w:val="20"/>
           <w:szCs w:val="20"/>
         </w:rPr>
-        <w:t xml:space="preserve">: </w:t>
+        <w:t xml:space="preserve"> </w:t>
       </w:r>
       <w:r>
         <w:rPr>
@@ -253,7 +249,7 @@
           <w:sz w:val="20"/>
           <w:szCs w:val="20"/>
         </w:rPr>
-        <w:t>黄庆旭教授、何春阳教授</w:t>
+        <w:t>导师: 黄庆旭教授、何春阳教授</w:t>
       </w:r>
     </w:p>
     <w:p>

</xml_diff>

<commit_message>
fix(cv): update professor titles and remove abstract award
</commit_message>
<xml_diff>
--- a/assets/tianci-gu-cv.docx
+++ b/assets/tianci-gu-cv.docx
@@ -1387,7 +1387,7 @@
           <w:sz w:val="20"/>
           <w:szCs w:val="20"/>
         </w:rPr>
-        <w:t xml:space="preserve"> </w:t>
+        <w:t>教授、曾杰</w:t>
       </w:r>
       <w:r>
         <w:rPr>
@@ -1398,29 +1398,7 @@
           <w:sz w:val="20"/>
           <w:szCs w:val="20"/>
         </w:rPr>
-        <w:t>副教授、曾杰</w:t>
-      </w:r>
-      <w:r>
-        <w:rPr>
-          <w:rFonts w:ascii="Times New Roman" w:eastAsia="楷体" w:hAnsi="Times New Roman" w:cs="Times New Roman" w:hint="eastAsia"/>
-          <w:b/>
-          <w:bCs/>
-          <w:kern w:val="0"/>
-          <w:sz w:val="20"/>
-          <w:szCs w:val="20"/>
-        </w:rPr>
-        <w:t xml:space="preserve"> </w:t>
-      </w:r>
-      <w:r>
-        <w:rPr>
-          <w:rFonts w:ascii="Times New Roman" w:eastAsia="楷体" w:hAnsi="Times New Roman" w:cs="Times New Roman" w:hint="eastAsia"/>
-          <w:b/>
-          <w:bCs/>
-          <w:kern w:val="0"/>
-          <w:sz w:val="20"/>
-          <w:szCs w:val="20"/>
-        </w:rPr>
-        <w:t>副教授</w:t>
+        <w:t>教授</w:t>
       </w:r>
       <w:r>
         <w:rPr>
@@ -6918,15 +6896,17 @@
           <w:kern w:val="0"/>
           <w:sz w:val="22"/>
         </w:rPr>
-        <w:t>，</w:t>
+        <w:t>，42001187，长江中游城市群城镇化对生态系统健康驱动机制差异性研究，2021-01至2023-12，24万元，结题，</w:t>
       </w:r>
       <w:r>
         <w:rPr>
           <w:rFonts w:ascii="Times New Roman" w:eastAsia="楷体" w:hAnsi="Times New Roman" w:cs="微软雅黑"/>
-          <w:kern w:val="0"/>
-          <w:sz w:val="22"/>
-        </w:rPr>
-        <w:t>42001187</w:t>
+          <w:b/>
+          <w:bCs/>
+          <w:kern w:val="0"/>
+          <w:sz w:val="22"/>
+        </w:rPr>
+        <w:t>参与</w:t>
       </w:r>
       <w:r>
         <w:rPr>
@@ -6934,7 +6914,7 @@
           <w:kern w:val="0"/>
           <w:sz w:val="22"/>
         </w:rPr>
-        <w:t>，长江中游城市群城镇化对生态系统健康驱动机制差异性研究，</w:t>
+        <w:t>（项目负责人：陈万旭</w:t>
       </w:r>
       <w:r>
         <w:rPr>
@@ -6942,65 +6922,7 @@
           <w:kern w:val="0"/>
           <w:sz w:val="22"/>
         </w:rPr>
-        <w:t>2021-01</w:t>
-      </w:r>
-      <w:r>
-        <w:rPr>
-          <w:rFonts w:ascii="Times New Roman" w:eastAsia="楷体" w:hAnsi="Times New Roman" w:cs="微软雅黑"/>
-          <w:kern w:val="0"/>
-          <w:sz w:val="22"/>
-        </w:rPr>
-        <w:t>至</w:t>
-      </w:r>
-      <w:r>
-        <w:rPr>
-          <w:rFonts w:ascii="Times New Roman" w:eastAsia="楷体" w:hAnsi="Times New Roman" w:cs="微软雅黑"/>
-          <w:kern w:val="0"/>
-          <w:sz w:val="22"/>
-        </w:rPr>
-        <w:t>2023-12</w:t>
-      </w:r>
-      <w:r>
-        <w:rPr>
-          <w:rFonts w:ascii="Times New Roman" w:eastAsia="楷体" w:hAnsi="Times New Roman" w:cs="微软雅黑"/>
-          <w:kern w:val="0"/>
-          <w:sz w:val="22"/>
-        </w:rPr>
-        <w:t>，</w:t>
-      </w:r>
-      <w:r>
-        <w:rPr>
-          <w:rFonts w:ascii="Times New Roman" w:eastAsia="楷体" w:hAnsi="Times New Roman" w:cs="微软雅黑"/>
-          <w:kern w:val="0"/>
-          <w:sz w:val="22"/>
-        </w:rPr>
-        <w:t>24</w:t>
-      </w:r>
-      <w:r>
-        <w:rPr>
-          <w:rFonts w:ascii="Times New Roman" w:eastAsia="楷体" w:hAnsi="Times New Roman" w:cs="微软雅黑"/>
-          <w:kern w:val="0"/>
-          <w:sz w:val="22"/>
-        </w:rPr>
-        <w:t>万元，结题，</w:t>
-      </w:r>
-      <w:r>
-        <w:rPr>
-          <w:rFonts w:ascii="Times New Roman" w:eastAsia="楷体" w:hAnsi="Times New Roman" w:cs="微软雅黑"/>
-          <w:b/>
-          <w:bCs/>
-          <w:kern w:val="0"/>
-          <w:sz w:val="22"/>
-        </w:rPr>
-        <w:t>参与</w:t>
-      </w:r>
-      <w:r>
-        <w:rPr>
-          <w:rFonts w:ascii="Times New Roman" w:eastAsia="楷体" w:hAnsi="Times New Roman" w:cs="微软雅黑"/>
-          <w:kern w:val="0"/>
-          <w:sz w:val="22"/>
-        </w:rPr>
-        <w:t>（项目负责人：陈万旭副教授），负责生态系统健康评估模型构建与数据分析</w:t>
+        <w:t>教授），负责生态系统健康评估模型构建与数据分析</w:t>
       </w:r>
     </w:p>
     <w:p>
@@ -7180,15 +7102,17 @@
           <w:kern w:val="0"/>
           <w:sz w:val="22"/>
         </w:rPr>
-        <w:t>，</w:t>
+        <w:t>，GTYR202205，长江黄河流域城镇化对生态系统健康影响差异性研究，2022-09至2024-09，5万元，结题，</w:t>
       </w:r>
       <w:r>
         <w:rPr>
           <w:rFonts w:ascii="Times New Roman" w:eastAsia="楷体" w:hAnsi="Times New Roman" w:cs="微软雅黑"/>
-          <w:kern w:val="0"/>
-          <w:sz w:val="22"/>
-        </w:rPr>
-        <w:t>GTYR202205</w:t>
+          <w:b/>
+          <w:bCs/>
+          <w:kern w:val="0"/>
+          <w:sz w:val="22"/>
+        </w:rPr>
+        <w:t>参与</w:t>
       </w:r>
       <w:r>
         <w:rPr>
@@ -7196,7 +7120,7 @@
           <w:kern w:val="0"/>
           <w:sz w:val="22"/>
         </w:rPr>
-        <w:t>，长江黄河流域城镇化对生态系统健康影响差异性研究，</w:t>
+        <w:t>（项目负责人：陈万旭</w:t>
       </w:r>
       <w:r>
         <w:rPr>
@@ -7204,65 +7128,7 @@
           <w:kern w:val="0"/>
           <w:sz w:val="22"/>
         </w:rPr>
-        <w:t>2022-09</w:t>
-      </w:r>
-      <w:r>
-        <w:rPr>
-          <w:rFonts w:ascii="Times New Roman" w:eastAsia="楷体" w:hAnsi="Times New Roman" w:cs="微软雅黑"/>
-          <w:kern w:val="0"/>
-          <w:sz w:val="22"/>
-        </w:rPr>
-        <w:t>至</w:t>
-      </w:r>
-      <w:r>
-        <w:rPr>
-          <w:rFonts w:ascii="Times New Roman" w:eastAsia="楷体" w:hAnsi="Times New Roman" w:cs="微软雅黑"/>
-          <w:kern w:val="0"/>
-          <w:sz w:val="22"/>
-        </w:rPr>
-        <w:t>2024-09</w:t>
-      </w:r>
-      <w:r>
-        <w:rPr>
-          <w:rFonts w:ascii="Times New Roman" w:eastAsia="楷体" w:hAnsi="Times New Roman" w:cs="微软雅黑"/>
-          <w:kern w:val="0"/>
-          <w:sz w:val="22"/>
-        </w:rPr>
-        <w:t>，</w:t>
-      </w:r>
-      <w:r>
-        <w:rPr>
-          <w:rFonts w:ascii="Times New Roman" w:eastAsia="楷体" w:hAnsi="Times New Roman" w:cs="微软雅黑"/>
-          <w:kern w:val="0"/>
-          <w:sz w:val="22"/>
-        </w:rPr>
-        <w:t>5</w:t>
-      </w:r>
-      <w:r>
-        <w:rPr>
-          <w:rFonts w:ascii="Times New Roman" w:eastAsia="楷体" w:hAnsi="Times New Roman" w:cs="微软雅黑"/>
-          <w:kern w:val="0"/>
-          <w:sz w:val="22"/>
-        </w:rPr>
-        <w:t>万元，结题，</w:t>
-      </w:r>
-      <w:r>
-        <w:rPr>
-          <w:rFonts w:ascii="Times New Roman" w:eastAsia="楷体" w:hAnsi="Times New Roman" w:cs="微软雅黑"/>
-          <w:b/>
-          <w:bCs/>
-          <w:kern w:val="0"/>
-          <w:sz w:val="22"/>
-        </w:rPr>
-        <w:t>参与</w:t>
-      </w:r>
-      <w:r>
-        <w:rPr>
-          <w:rFonts w:ascii="Times New Roman" w:eastAsia="楷体" w:hAnsi="Times New Roman" w:cs="微软雅黑"/>
-          <w:kern w:val="0"/>
-          <w:sz w:val="22"/>
-        </w:rPr>
-        <w:t>（项目负责人：陈万旭副教授）</w:t>
+        <w:t>教授）</w:t>
       </w:r>
     </w:p>
     <w:p>
@@ -7298,15 +7164,17 @@
           <w:kern w:val="0"/>
           <w:sz w:val="22"/>
         </w:rPr>
-        <w:t>，</w:t>
+        <w:t>，2021-KF-03，中国城市群城镇化对生态系统服务驱动机制差异性研究，2021-06至2022-12，8万元，结题，</w:t>
       </w:r>
       <w:r>
         <w:rPr>
           <w:rFonts w:ascii="Times New Roman" w:eastAsia="楷体" w:hAnsi="Times New Roman" w:cs="微软雅黑"/>
-          <w:kern w:val="0"/>
-          <w:sz w:val="22"/>
-        </w:rPr>
-        <w:t>2021-KF-03</w:t>
+          <w:b/>
+          <w:bCs/>
+          <w:kern w:val="0"/>
+          <w:sz w:val="22"/>
+        </w:rPr>
+        <w:t>参与</w:t>
       </w:r>
       <w:r>
         <w:rPr>
@@ -7314,7 +7182,7 @@
           <w:kern w:val="0"/>
           <w:sz w:val="22"/>
         </w:rPr>
-        <w:t>，中国城市群城镇化对生态系统服务驱动机制差异性研究，</w:t>
+        <w:t>（项目负责人：陈万旭</w:t>
       </w:r>
       <w:r>
         <w:rPr>
@@ -7322,65 +7190,7 @@
           <w:kern w:val="0"/>
           <w:sz w:val="22"/>
         </w:rPr>
-        <w:t>2021-06</w:t>
-      </w:r>
-      <w:r>
-        <w:rPr>
-          <w:rFonts w:ascii="Times New Roman" w:eastAsia="楷体" w:hAnsi="Times New Roman" w:cs="微软雅黑"/>
-          <w:kern w:val="0"/>
-          <w:sz w:val="22"/>
-        </w:rPr>
-        <w:t>至</w:t>
-      </w:r>
-      <w:r>
-        <w:rPr>
-          <w:rFonts w:ascii="Times New Roman" w:eastAsia="楷体" w:hAnsi="Times New Roman" w:cs="微软雅黑"/>
-          <w:kern w:val="0"/>
-          <w:sz w:val="22"/>
-        </w:rPr>
-        <w:t>2022-12</w:t>
-      </w:r>
-      <w:r>
-        <w:rPr>
-          <w:rFonts w:ascii="Times New Roman" w:eastAsia="楷体" w:hAnsi="Times New Roman" w:cs="微软雅黑"/>
-          <w:kern w:val="0"/>
-          <w:sz w:val="22"/>
-        </w:rPr>
-        <w:t>，</w:t>
-      </w:r>
-      <w:r>
-        <w:rPr>
-          <w:rFonts w:ascii="Times New Roman" w:eastAsia="楷体" w:hAnsi="Times New Roman" w:cs="微软雅黑"/>
-          <w:kern w:val="0"/>
-          <w:sz w:val="22"/>
-        </w:rPr>
-        <w:t>8</w:t>
-      </w:r>
-      <w:r>
-        <w:rPr>
-          <w:rFonts w:ascii="Times New Roman" w:eastAsia="楷体" w:hAnsi="Times New Roman" w:cs="微软雅黑"/>
-          <w:kern w:val="0"/>
-          <w:sz w:val="22"/>
-        </w:rPr>
-        <w:t>万元，结题，</w:t>
-      </w:r>
-      <w:r>
-        <w:rPr>
-          <w:rFonts w:ascii="Times New Roman" w:eastAsia="楷体" w:hAnsi="Times New Roman" w:cs="微软雅黑"/>
-          <w:b/>
-          <w:bCs/>
-          <w:kern w:val="0"/>
-          <w:sz w:val="22"/>
-        </w:rPr>
-        <w:t>参与</w:t>
-      </w:r>
-      <w:r>
-        <w:rPr>
-          <w:rFonts w:ascii="Times New Roman" w:eastAsia="楷体" w:hAnsi="Times New Roman" w:cs="微软雅黑"/>
-          <w:kern w:val="0"/>
-          <w:sz w:val="22"/>
-        </w:rPr>
-        <w:t>（项目负责人：陈万旭副教授）</w:t>
+        <w:t>教授）</w:t>
       </w:r>
     </w:p>
     <w:p>
@@ -8271,7 +8081,7 @@
           <w:sz w:val="18"/>
           <w:szCs w:val="18"/>
         </w:rPr>
-        <w:t>7.2025</w:t>
+        <w:t>7</w:t>
       </w:r>
       <w:r>
         <w:rPr>
@@ -8280,61 +8090,9 @@
           <w:sz w:val="18"/>
           <w:szCs w:val="18"/>
         </w:rPr>
-        <w:t>年学术年会优秀摘要一等奖</w:t>
-      </w:r>
-      <w:r>
-        <w:rPr>
-          <w:rFonts w:ascii="Times New Roman" w:eastAsia="楷体" w:hAnsi="Times New Roman" w:cs="STKaitiSC-Regular" w:hint="eastAsia"/>
-          <w:kern w:val="0"/>
-          <w:sz w:val="18"/>
-          <w:szCs w:val="18"/>
-        </w:rPr>
+        <w:t>.2025年学术年会优秀报告一等奖（北京师范大学）</w:t>
         <w:tab/>
-      </w:r>
-      <w:r>
-        <w:rPr>
-          <w:rFonts w:ascii="Times New Roman" w:eastAsia="楷体" w:hAnsi="Times New Roman" w:cs="STKaitiSC-Regular" w:hint="eastAsia"/>
-          <w:kern w:val="0"/>
-          <w:sz w:val="18"/>
-          <w:szCs w:val="18"/>
-        </w:rPr>
-        <w:tab/>
-      </w:r>
-      <w:r>
-        <w:rPr>
-          <w:rFonts w:ascii="Times New Roman" w:eastAsia="楷体" w:hAnsi="Times New Roman" w:cs="STKaitiSC-Regular" w:hint="eastAsia"/>
-          <w:kern w:val="0"/>
-          <w:sz w:val="18"/>
-          <w:szCs w:val="18"/>
-        </w:rPr>
-        <w:tab/>
-      </w:r>
-      <w:r>
-        <w:rPr>
-          <w:rFonts w:ascii="Times New Roman" w:eastAsia="楷体" w:hAnsi="Times New Roman" w:cs="STKaitiSC-Regular" w:hint="eastAsia"/>
-          <w:kern w:val="0"/>
-          <w:sz w:val="18"/>
-          <w:szCs w:val="18"/>
-        </w:rPr>
-        <w:t>校</w:t>
-      </w:r>
-      <w:r>
-        <w:rPr>
-          <w:rFonts w:ascii="Times New Roman" w:eastAsia="楷体" w:hAnsi="Times New Roman" w:cs="STKaitiSC-Regular" w:hint="eastAsia"/>
-          <w:kern w:val="0"/>
-          <w:sz w:val="18"/>
-          <w:szCs w:val="18"/>
-        </w:rPr>
-        <w:t xml:space="preserve">  </w:t>
-      </w:r>
-      <w:r>
-        <w:rPr>
-          <w:rFonts w:ascii="Times New Roman" w:eastAsia="楷体" w:hAnsi="Times New Roman" w:cs="STKaitiSC-Regular" w:hint="eastAsia"/>
-          <w:kern w:val="0"/>
-          <w:sz w:val="18"/>
-          <w:szCs w:val="18"/>
-        </w:rPr>
-        <w:t>级</w:t>
+        <w:t>校  级</w:t>
       </w:r>
     </w:p>
     <w:p>
@@ -8357,7 +8115,7 @@
           <w:sz w:val="18"/>
           <w:szCs w:val="18"/>
         </w:rPr>
-        <w:t>8.2025</w:t>
+        <w:t>8</w:t>
       </w:r>
       <w:r>
         <w:rPr>
@@ -8366,43 +8124,10 @@
           <w:sz w:val="18"/>
           <w:szCs w:val="18"/>
         </w:rPr>
-        <w:t>年学术年会优秀报告一等奖（北京师范大学）</w:t>
-      </w:r>
-      <w:r>
-        <w:rPr>
-          <w:rFonts w:ascii="Times New Roman" w:eastAsia="楷体" w:hAnsi="Times New Roman" w:cs="STKaitiSC-Regular" w:hint="eastAsia"/>
-          <w:kern w:val="0"/>
-          <w:sz w:val="18"/>
-          <w:szCs w:val="18"/>
-        </w:rPr>
+        <w:t>.2025年第五届微党课大赛一等奖</w:t>
         <w:tab/>
-      </w:r>
-      <w:r>
-        <w:rPr>
-          <w:rFonts w:ascii="Times New Roman" w:eastAsia="楷体" w:hAnsi="Times New Roman" w:cs="STKaitiSC-Regular" w:hint="eastAsia"/>
-          <w:kern w:val="0"/>
-          <w:sz w:val="18"/>
-          <w:szCs w:val="18"/>
-        </w:rPr>
-        <w:t>校</w:t>
-      </w:r>
-      <w:r>
-        <w:rPr>
-          <w:rFonts w:ascii="Times New Roman" w:eastAsia="楷体" w:hAnsi="Times New Roman" w:cs="STKaitiSC-Regular" w:hint="eastAsia"/>
-          <w:kern w:val="0"/>
-          <w:sz w:val="18"/>
-          <w:szCs w:val="18"/>
-        </w:rPr>
-        <w:t xml:space="preserve">  </w:t>
-      </w:r>
-      <w:r>
-        <w:rPr>
-          <w:rFonts w:ascii="Times New Roman" w:eastAsia="楷体" w:hAnsi="Times New Roman" w:cs="STKaitiSC-Regular" w:hint="eastAsia"/>
-          <w:kern w:val="0"/>
-          <w:sz w:val="18"/>
-          <w:szCs w:val="18"/>
-        </w:rPr>
-        <w:t>级</w:t>
+        <w:tab/>
+        <w:t>校  级</w:t>
       </w:r>
     </w:p>
     <w:p>
@@ -8425,7 +8150,7 @@
           <w:sz w:val="18"/>
           <w:szCs w:val="18"/>
         </w:rPr>
-        <w:t>9.2025</w:t>
+        <w:t>9</w:t>
       </w:r>
       <w:r>
         <w:rPr>
@@ -8434,138 +8159,11 @@
           <w:sz w:val="18"/>
           <w:szCs w:val="18"/>
         </w:rPr>
-        <w:t>年第五届微党课大赛一等奖</w:t>
-      </w:r>
-      <w:r>
-        <w:rPr>
-          <w:rFonts w:ascii="Times New Roman" w:eastAsia="楷体" w:hAnsi="Times New Roman" w:cs="STKaitiSC-Regular" w:hint="eastAsia"/>
-          <w:kern w:val="0"/>
-          <w:sz w:val="18"/>
-          <w:szCs w:val="18"/>
-        </w:rPr>
+        <w:t>.2024年学术年会优秀报告二等奖</w:t>
         <w:tab/>
-      </w:r>
-      <w:r>
-        <w:rPr>
-          <w:rFonts w:ascii="Times New Roman" w:eastAsia="楷体" w:hAnsi="Times New Roman" w:cs="STKaitiSC-Regular" w:hint="eastAsia"/>
-          <w:kern w:val="0"/>
-          <w:sz w:val="18"/>
-          <w:szCs w:val="18"/>
-        </w:rPr>
         <w:tab/>
-      </w:r>
-      <w:r>
-        <w:rPr>
-          <w:rFonts w:ascii="Times New Roman" w:eastAsia="楷体" w:hAnsi="Times New Roman" w:cs="STKaitiSC-Regular" w:hint="eastAsia"/>
-          <w:kern w:val="0"/>
-          <w:sz w:val="18"/>
-          <w:szCs w:val="18"/>
-        </w:rPr>
-        <w:t>校</w:t>
-      </w:r>
-      <w:r>
-        <w:rPr>
-          <w:rFonts w:ascii="Times New Roman" w:eastAsia="楷体" w:hAnsi="Times New Roman" w:cs="STKaitiSC-Regular" w:hint="eastAsia"/>
-          <w:kern w:val="0"/>
-          <w:sz w:val="18"/>
-          <w:szCs w:val="18"/>
-        </w:rPr>
-        <w:t xml:space="preserve">  </w:t>
-      </w:r>
-      <w:r>
-        <w:rPr>
-          <w:rFonts w:ascii="Times New Roman" w:eastAsia="楷体" w:hAnsi="Times New Roman" w:cs="STKaitiSC-Regular" w:hint="eastAsia"/>
-          <w:kern w:val="0"/>
-          <w:sz w:val="18"/>
-          <w:szCs w:val="18"/>
-        </w:rPr>
-        <w:t>级</w:t>
-      </w:r>
-    </w:p>
-    <w:p>
-      <w:pPr>
-        <w:autoSpaceDE w:val="0"/>
-        <w:autoSpaceDN w:val="0"/>
-        <w:adjustRightInd w:val="0"/>
-        <w:spacing w:before="20" w:line="240" w:lineRule="exact"/>
-        <w:rPr>
-          <w:rFonts w:ascii="Times New Roman" w:eastAsia="楷体" w:hAnsi="Times New Roman" w:cs="STKaitiSC-Regular"/>
-          <w:kern w:val="0"/>
-          <w:sz w:val="18"/>
-          <w:szCs w:val="18"/>
-        </w:rPr>
-      </w:pPr>
-      <w:r>
-        <w:rPr>
-          <w:rFonts w:ascii="Times New Roman" w:eastAsia="楷体" w:hAnsi="Times New Roman" w:cs="STKaitiSC-Regular" w:hint="eastAsia"/>
-          <w:kern w:val="0"/>
-          <w:sz w:val="18"/>
-          <w:szCs w:val="18"/>
-        </w:rPr>
-        <w:t>10.2024</w:t>
-      </w:r>
-      <w:r>
-        <w:rPr>
-          <w:rFonts w:ascii="Times New Roman" w:eastAsia="楷体" w:hAnsi="Times New Roman" w:cs="STKaitiSC-Regular" w:hint="eastAsia"/>
-          <w:kern w:val="0"/>
-          <w:sz w:val="18"/>
-          <w:szCs w:val="18"/>
-        </w:rPr>
-        <w:t>年学术年会优秀报告二等奖</w:t>
-      </w:r>
-      <w:r>
-        <w:rPr>
-          <w:rFonts w:ascii="Times New Roman" w:eastAsia="楷体" w:hAnsi="Times New Roman" w:cs="STKaitiSC-Regular" w:hint="eastAsia"/>
-          <w:kern w:val="0"/>
-          <w:sz w:val="18"/>
-          <w:szCs w:val="18"/>
-        </w:rPr>
         <w:tab/>
-      </w:r>
-      <w:r>
-        <w:rPr>
-          <w:rFonts w:ascii="Times New Roman" w:eastAsia="楷体" w:hAnsi="Times New Roman" w:cs="STKaitiSC-Regular" w:hint="eastAsia"/>
-          <w:kern w:val="0"/>
-          <w:sz w:val="18"/>
-          <w:szCs w:val="18"/>
-        </w:rPr>
-        <w:tab/>
-      </w:r>
-      <w:r>
-        <w:rPr>
-          <w:rFonts w:ascii="Times New Roman" w:eastAsia="楷体" w:hAnsi="Times New Roman" w:cs="STKaitiSC-Regular" w:hint="eastAsia"/>
-          <w:kern w:val="0"/>
-          <w:sz w:val="18"/>
-          <w:szCs w:val="18"/>
-        </w:rPr>
-        <w:tab/>
-      </w:r>
-      <w:r>
-        <w:rPr>
-          <w:rFonts w:ascii="Times New Roman" w:eastAsia="楷体" w:hAnsi="Times New Roman" w:cs="STKaitiSC-Regular" w:hint="eastAsia"/>
-          <w:kern w:val="0"/>
-          <w:sz w:val="18"/>
-          <w:szCs w:val="18"/>
-        </w:rPr>
-        <w:t>校</w:t>
-      </w:r>
-      <w:r>
-        <w:rPr>
-          <w:rFonts w:ascii="Times New Roman" w:eastAsia="楷体" w:hAnsi="Times New Roman" w:cs="STKaitiSC-Regular" w:hint="eastAsia"/>
-          <w:kern w:val="0"/>
-          <w:sz w:val="18"/>
-          <w:szCs w:val="18"/>
-        </w:rPr>
-        <w:t xml:space="preserve">  </w:t>
-      </w:r>
-      <w:r>
-        <w:rPr>
-          <w:rFonts w:ascii="Times New Roman" w:eastAsia="楷体" w:hAnsi="Times New Roman" w:cs="STKaitiSC-Regular" w:hint="eastAsia"/>
-          <w:kern w:val="0"/>
-          <w:sz w:val="18"/>
-          <w:szCs w:val="18"/>
-        </w:rPr>
-        <w:t>级</w:t>
+        <w:t>校  级</w:t>
       </w:r>
     </w:p>
     <w:p>

</xml_diff>

<commit_message>
fix(publications): withdraw manuscripts and use author supplied figures
</commit_message>
<xml_diff>
--- a/assets/tianci-gu-cv.docx
+++ b/assets/tianci-gu-cv.docx
@@ -2284,288 +2284,6 @@
           <w:szCs w:val="20"/>
         </w:rPr>
         <w:t>本人标注：共同第一作者。本人贡献：共同主导研究设计、数据处理与分析、初稿撰写及部分修改。</w:t>
-      </w:r>
-    </w:p>
-    <w:p>
-      <w:pPr>
-        <w:keepLines/>
-        <w:numPr>
-          <w:ilvl w:val="0"/>
-          <w:numId w:val="28"/>
-        </w:numPr>
-        <w:autoSpaceDE w:val="0"/>
-        <w:autoSpaceDN w:val="0"/>
-        <w:adjustRightInd w:val="0"/>
-        <w:spacing w:before="40" w:line="280" w:lineRule="exact"/>
-        <w:rPr>
-          <w:rFonts w:ascii="Times New Roman" w:eastAsia="楷体" w:hAnsi="Times New Roman" w:cs="Times New Roman"/>
-          <w:kern w:val="0"/>
-          <w:sz w:val="22"/>
-        </w:rPr>
-      </w:pPr>
-      <w:r>
-        <w:rPr>
-          <w:rFonts w:ascii="Times New Roman" w:eastAsia="楷体" w:hAnsi="Times New Roman" w:cs="Times New Roman"/>
-          <w:b/>
-          <w:bCs/>
-          <w:kern w:val="0"/>
-          <w:sz w:val="22"/>
-        </w:rPr>
-        <w:t>Gu, T.</w:t>
-      </w:r>
-      <w:r>
-        <w:rPr>
-          <w:rFonts w:ascii="Times New Roman" w:eastAsia="楷体" w:hAnsi="Times New Roman" w:cs="Times New Roman"/>
-          <w:kern w:val="0"/>
-          <w:sz w:val="22"/>
-        </w:rPr>
-        <w:t xml:space="preserve">, Chen, W., Liang, J., Pan, S., &amp; Ye, X. (2023). Identifying the driving forces of cultivated land fragmentation in China. </w:t>
-      </w:r>
-      <w:r>
-        <w:rPr>
-          <w:rFonts w:ascii="Times New Roman" w:eastAsia="楷体" w:hAnsi="Times New Roman" w:cs="Times New Roman"/>
-          <w:b/>
-          <w:bCs/>
-          <w:i/>
-          <w:iCs/>
-          <w:kern w:val="0"/>
-          <w:sz w:val="22"/>
-        </w:rPr>
-        <w:t>Environmental Science and Pollution Research</w:t>
-      </w:r>
-      <w:r>
-        <w:rPr>
-          <w:rFonts w:ascii="Times New Roman" w:eastAsia="楷体" w:hAnsi="Times New Roman" w:cs="Times New Roman"/>
-          <w:kern w:val="0"/>
-          <w:sz w:val="22"/>
-        </w:rPr>
-        <w:t xml:space="preserve">, 30(48), 105275-105292. </w:t>
-      </w:r>
-      <w:r>
-        <w:rPr>
-          <w:rFonts w:ascii="Times New Roman" w:eastAsia="楷体" w:hAnsi="Times New Roman" w:cs="Times New Roman"/>
-          <w:kern w:val="0"/>
-          <w:sz w:val="22"/>
-        </w:rPr>
-        <w:t>（</w:t>
-      </w:r>
-      <w:r>
-        <w:rPr>
-          <w:rFonts w:ascii="Times New Roman" w:eastAsia="楷体" w:hAnsi="Times New Roman" w:cs="Times New Roman" w:hint="eastAsia"/>
-          <w:kern w:val="0"/>
-          <w:sz w:val="22"/>
-        </w:rPr>
-        <w:t>EI</w:t>
-      </w:r>
-      <w:r>
-        <w:rPr>
-          <w:rFonts w:ascii="Times New Roman" w:eastAsia="楷体" w:hAnsi="Times New Roman" w:cs="Times New Roman"/>
-          <w:kern w:val="0"/>
-          <w:sz w:val="22"/>
-        </w:rPr>
-        <w:t>）</w:t>
-      </w:r>
-    </w:p>
-    <w:p>
-      <w:pPr>
-        <w:keepNext/>
-        <w:autoSpaceDE w:val="0"/>
-        <w:autoSpaceDN w:val="0"/>
-        <w:adjustRightInd w:val="0"/>
-        <w:spacing w:before="40" w:line="280" w:lineRule="exact"/>
-        <w:rPr>
-          <w:rFonts w:ascii="Times New Roman" w:eastAsia="楷体" w:hAnsi="Times New Roman" w:cs="Times New Roman"/>
-          <w:b/>
-          <w:bCs/>
-          <w:kern w:val="0"/>
-          <w:sz w:val="22"/>
-        </w:rPr>
-      </w:pPr>
-      <w:r>
-        <w:rPr>
-          <w:rFonts w:ascii="Times New Roman" w:eastAsia="楷体" w:hAnsi="Times New Roman" w:cs="Times New Roman"/>
-          <w:b/>
-          <w:bCs/>
-          <w:kern w:val="0"/>
-          <w:sz w:val="22"/>
-        </w:rPr>
-        <w:t>在审论文</w:t>
-      </w:r>
-    </w:p>
-    <w:p>
-      <w:pPr>
-        <w:keepNext/>
-        <w:keepLines/>
-        <w:numPr>
-          <w:ilvl w:val="0"/>
-          <w:numId w:val="28"/>
-        </w:numPr>
-        <w:autoSpaceDE w:val="0"/>
-        <w:autoSpaceDN w:val="0"/>
-        <w:adjustRightInd w:val="0"/>
-        <w:spacing w:before="40" w:line="280" w:lineRule="exact"/>
-        <w:rPr>
-          <w:rFonts w:ascii="Times New Roman" w:eastAsia="楷体" w:hAnsi="Times New Roman" w:cs="Times New Roman"/>
-          <w:kern w:val="0"/>
-          <w:sz w:val="22"/>
-        </w:rPr>
-      </w:pPr>
-      <w:r>
-        <w:rPr>
-          <w:rFonts w:ascii="Times New Roman" w:eastAsia="楷体" w:hAnsi="Times New Roman" w:cs="Times New Roman"/>
-          <w:kern w:val="0"/>
-          <w:sz w:val="22"/>
-        </w:rPr>
-        <w:t>Gu, T., Huang, Q., McDonald, R., Bryan, B., He, C., &amp; Fath, B. A silver lining of urbanization for biodiversity: A Metros for Meadows counterfactual reveals compact urban land sparing. Nature Sustainability (Under Review).</w:t>
-      </w:r>
-    </w:p>
-    <w:p>
-      <w:pPr>
-        <w:keepLines/>
-        <w:autoSpaceDE w:val="0"/>
-        <w:autoSpaceDN w:val="0"/>
-        <w:adjustRightInd w:val="0"/>
-        <w:spacing w:line="280" w:lineRule="exact"/>
-        <w:jc w:val="left"/>
-        <w:rPr>
-          <w:rFonts w:ascii="Times New Roman" w:eastAsia="楷体" w:hAnsi="Times New Roman" w:cs="Times New Roman"/>
-          <w:kern w:val="0"/>
-          <w:sz w:val="20"/>
-          <w:szCs w:val="20"/>
-        </w:rPr>
-      </w:pPr>
-      <w:r>
-        <w:rPr>
-          <w:rFonts w:ascii="Times New Roman" w:eastAsia="楷体" w:hAnsi="Times New Roman" w:cs="Times New Roman" w:hint="eastAsia"/>
-          <w:kern w:val="0"/>
-          <w:sz w:val="20"/>
-          <w:szCs w:val="20"/>
-        </w:rPr>
-        <w:t>本人标注：第一作者；在审。本人贡献：研究设计、指标构建、数据处理与分析、论文撰写及返修。</w:t>
-      </w:r>
-    </w:p>
-    <w:p>
-      <w:pPr>
-        <w:keepNext/>
-        <w:keepLines/>
-        <w:numPr>
-          <w:ilvl w:val="0"/>
-          <w:numId w:val="28"/>
-        </w:numPr>
-        <w:autoSpaceDE w:val="0"/>
-        <w:autoSpaceDN w:val="0"/>
-        <w:adjustRightInd w:val="0"/>
-        <w:spacing w:before="40" w:line="280" w:lineRule="exact"/>
-        <w:rPr>
-          <w:rFonts w:ascii="Times New Roman" w:eastAsia="楷体" w:hAnsi="Times New Roman" w:cs="Times New Roman"/>
-          <w:kern w:val="0"/>
-          <w:sz w:val="22"/>
-        </w:rPr>
-      </w:pPr>
-      <w:r>
-        <w:rPr>
-          <w:rFonts w:ascii="Times New Roman" w:eastAsia="楷体" w:hAnsi="Times New Roman" w:cs="Times New Roman"/>
-          <w:b/>
-          <w:bCs/>
-          <w:kern w:val="0"/>
-          <w:sz w:val="22"/>
-        </w:rPr>
-        <w:t>Gu, T</w:t>
-      </w:r>
-      <w:r>
-        <w:rPr>
-          <w:rFonts w:ascii="Times New Roman" w:eastAsia="楷体" w:hAnsi="Times New Roman" w:cs="Times New Roman"/>
-          <w:kern w:val="0"/>
-          <w:sz w:val="22"/>
-        </w:rPr>
-        <w:t>., Huang, Q., Liao, C., Villasante, S., &amp; Aynekulu, E. The golden window of transformation: How urban visions and urbanization interact to drive sustainable change. Global Sustainability (Under Review).</w:t>
-      </w:r>
-    </w:p>
-    <w:p>
-      <w:pPr>
-        <w:keepLines/>
-        <w:autoSpaceDE w:val="0"/>
-        <w:autoSpaceDN w:val="0"/>
-        <w:adjustRightInd w:val="0"/>
-        <w:spacing w:line="280" w:lineRule="exact"/>
-        <w:jc w:val="left"/>
-        <w:rPr>
-          <w:rFonts w:ascii="Times New Roman" w:eastAsia="楷体" w:hAnsi="Times New Roman" w:cs="Times New Roman"/>
-          <w:kern w:val="0"/>
-          <w:sz w:val="20"/>
-          <w:szCs w:val="20"/>
-        </w:rPr>
-      </w:pPr>
-      <w:r>
-        <w:rPr>
-          <w:rFonts w:ascii="Times New Roman" w:eastAsia="楷体" w:hAnsi="Times New Roman" w:cs="Times New Roman" w:hint="eastAsia"/>
-          <w:kern w:val="0"/>
-          <w:sz w:val="20"/>
-          <w:szCs w:val="20"/>
-        </w:rPr>
-        <w:t>本人标注：第一作者；在审。本人贡献：研究设计、指标构建、数据处理与分析、论文撰写及返修。</w:t>
-      </w:r>
-    </w:p>
-    <w:p>
-      <w:pPr>
-        <w:keepNext/>
-        <w:keepLines/>
-        <w:numPr>
-          <w:ilvl w:val="0"/>
-          <w:numId w:val="28"/>
-        </w:numPr>
-        <w:autoSpaceDE w:val="0"/>
-        <w:autoSpaceDN w:val="0"/>
-        <w:adjustRightInd w:val="0"/>
-        <w:spacing w:before="40" w:line="280" w:lineRule="exact"/>
-        <w:rPr>
-          <w:rFonts w:ascii="Times New Roman" w:eastAsia="楷体" w:hAnsi="Times New Roman" w:cs="Times New Roman"/>
-          <w:kern w:val="0"/>
-          <w:sz w:val="22"/>
-        </w:rPr>
-      </w:pPr>
-      <w:r>
-        <w:rPr>
-          <w:rFonts w:ascii="Times New Roman" w:eastAsia="楷体" w:hAnsi="Times New Roman" w:cs="Times New Roman"/>
-          <w:b/>
-          <w:bCs/>
-          <w:kern w:val="0"/>
-          <w:sz w:val="22"/>
-        </w:rPr>
-        <w:t>Gu, T</w:t>
-      </w:r>
-      <w:r>
-        <w:rPr>
-          <w:rFonts w:ascii="Times New Roman" w:eastAsia="楷体" w:hAnsi="Times New Roman" w:cs="Times New Roman"/>
-          <w:kern w:val="0"/>
-          <w:sz w:val="22"/>
-        </w:rPr>
-        <w:t>., Huang, Q., Ren, Q. Protecting the safe havens: Disproportionate declines in habitat quality within the ranges of IUCN Red List Species in China. Global Change Biology (Under Review).</w:t>
-      </w:r>
-    </w:p>
-    <w:p>
-      <w:pPr>
-        <w:keepLines/>
-        <w:autoSpaceDE w:val="0"/>
-        <w:autoSpaceDN w:val="0"/>
-        <w:adjustRightInd w:val="0"/>
-        <w:spacing w:line="280" w:lineRule="exact"/>
-        <w:jc w:val="left"/>
-        <w:rPr>
-          <w:rFonts w:ascii="Times New Roman" w:eastAsia="楷体" w:hAnsi="Times New Roman" w:cs="Times New Roman"/>
-          <w:kern w:val="0"/>
-          <w:sz w:val="20"/>
-          <w:szCs w:val="20"/>
-        </w:rPr>
-      </w:pPr>
-      <w:r>
-        <w:rPr>
-          <w:rFonts w:ascii="Times New Roman" w:eastAsia="楷体" w:hAnsi="Times New Roman" w:cs="Times New Roman" w:hint="eastAsia"/>
-          <w:kern w:val="0"/>
-          <w:sz w:val="20"/>
-          <w:szCs w:val="20"/>
-        </w:rPr>
-        <w:t>本人标注：第一作者；在审。本人贡献：研究设计、指标构建、数据处理与分析、论文撰写及返修。</w:t>
       </w:r>
     </w:p>
     <w:p>

</xml_diff>

<commit_message>
fix(education): unify typography and advisor title
</commit_message>
<xml_diff>
--- a/assets/tianci-gu-cv.docx
+++ b/assets/tianci-gu-cv.docx
@@ -1449,7 +1449,25 @@
           <w:sz w:val="20"/>
           <w:szCs w:val="20"/>
         </w:rPr>
-        <w:t>硕士专业：地理学（人文地理方向）；本科导师：徐丽萍。</w:t>
+        <w:t>硕士专业：地理学（人文地理方向）；本科导师：徐丽萍</w:t>
+      </w:r>
+      <w:r>
+        <w:rPr>
+          <w:rFonts w:ascii="Times New Roman" w:eastAsia="楷体" w:hAnsi="Times New Roman" w:cs="Times New Roman" w:hint="eastAsia"/>
+          <w:kern w:val="0"/>
+          <w:sz w:val="20"/>
+          <w:szCs w:val="20"/>
+        </w:rPr>
+        <w:t>教授</w:t>
+      </w:r>
+      <w:r>
+        <w:rPr>
+          <w:rFonts w:ascii="Times New Roman" w:eastAsia="楷体" w:hAnsi="Times New Roman" w:cs="Times New Roman" w:hint="eastAsia"/>
+          <w:kern w:val="0"/>
+          <w:sz w:val="20"/>
+          <w:szCs w:val="20"/>
+        </w:rPr>
+        <w:t>。</w:t>
       </w:r>
     </w:p>
     <w:p>

</xml_diff>

<commit_message>
fix(publications): correct corresponding authors and resume
</commit_message>
<xml_diff>
--- a/assets/tianci-gu-cv.docx
+++ b/assets/tianci-gu-cv.docx
@@ -1523,7 +1523,7 @@
           <w:sz w:val="20"/>
           <w:szCs w:val="20"/>
         </w:rPr>
-        <w:t>已发表第一或共同第一作者论文</w:t>
+        <w:t>已发表第一或共同第一作者论文4篇、通讯或共同通讯作者论文</w:t>
       </w:r>
       <w:r>
         <w:rPr>
@@ -1532,7 +1532,7 @@
           <w:sz w:val="20"/>
           <w:szCs w:val="20"/>
         </w:rPr>
-        <w:t>4</w:t>
+        <w:t>7</w:t>
       </w:r>
       <w:r>
         <w:rPr>
@@ -1541,133 +1541,7 @@
           <w:sz w:val="20"/>
           <w:szCs w:val="20"/>
         </w:rPr>
-        <w:t>篇、通讯或共同通讯作者论文</w:t>
-      </w:r>
-      <w:r>
-        <w:rPr>
-          <w:rFonts w:ascii="Times New Roman" w:eastAsia="楷体" w:hAnsi="Times New Roman" w:cs="Times New Roman" w:hint="eastAsia"/>
-          <w:kern w:val="0"/>
-          <w:sz w:val="20"/>
-          <w:szCs w:val="20"/>
-        </w:rPr>
-        <w:t>8</w:t>
-      </w:r>
-      <w:r>
-        <w:rPr>
-          <w:rFonts w:ascii="Times New Roman" w:eastAsia="楷体" w:hAnsi="Times New Roman" w:cs="Times New Roman" w:hint="eastAsia"/>
-          <w:kern w:val="0"/>
-          <w:sz w:val="20"/>
-          <w:szCs w:val="20"/>
-        </w:rPr>
-        <w:t xml:space="preserve">篇，另以第二作者参与5篇论文，均由导师担任第一作者</w:t>
-      </w:r>
-      <w:r>
-        <w:rPr>
-          <w:rFonts w:ascii="Times New Roman" w:eastAsia="楷体" w:hAnsi="Times New Roman" w:cs="Times New Roman" w:hint="eastAsia"/>
-          <w:kern w:val="0"/>
-          <w:sz w:val="20"/>
-          <w:szCs w:val="20"/>
-        </w:rPr>
-        <w:t xml:space="preserve"/>
-      </w:r>
-      <w:r>
-        <w:rPr>
-          <w:rFonts w:ascii="Times New Roman" w:eastAsia="楷体" w:hAnsi="Times New Roman" w:cs="Times New Roman" w:hint="eastAsia"/>
-          <w:kern w:val="0"/>
-          <w:sz w:val="20"/>
-          <w:szCs w:val="20"/>
-        </w:rPr>
-        <w:t xml:space="preserve">；</w:t>
-      </w:r>
-      <w:r>
-        <w:rPr>
-          <w:rFonts w:ascii="Times New Roman" w:eastAsia="楷体" w:hAnsi="Times New Roman" w:cs="Times New Roman" w:hint="eastAsia"/>
-          <w:kern w:val="0"/>
-          <w:sz w:val="20"/>
-          <w:szCs w:val="20"/>
-        </w:rPr>
-        <w:t>ESI</w:t>
-      </w:r>
-      <w:r>
-        <w:rPr>
-          <w:rFonts w:ascii="Times New Roman" w:eastAsia="楷体" w:hAnsi="Times New Roman" w:cs="Times New Roman" w:hint="eastAsia"/>
-          <w:kern w:val="0"/>
-          <w:sz w:val="20"/>
-          <w:szCs w:val="20"/>
-        </w:rPr>
-        <w:t>高被引论文</w:t>
-      </w:r>
-      <w:r>
-        <w:rPr>
-          <w:rFonts w:ascii="Times New Roman" w:eastAsia="楷体" w:hAnsi="Times New Roman" w:cs="Times New Roman" w:hint="eastAsia"/>
-          <w:kern w:val="0"/>
-          <w:sz w:val="20"/>
-          <w:szCs w:val="20"/>
-        </w:rPr>
-        <w:t>4</w:t>
-      </w:r>
-      <w:r>
-        <w:rPr>
-          <w:rFonts w:ascii="Times New Roman" w:eastAsia="楷体" w:hAnsi="Times New Roman" w:cs="Times New Roman" w:hint="eastAsia"/>
-          <w:kern w:val="0"/>
-          <w:sz w:val="20"/>
-          <w:szCs w:val="20"/>
-        </w:rPr>
-        <w:t>篇。成果发表于</w:t>
-      </w:r>
-      <w:r>
-        <w:rPr>
-          <w:rFonts w:ascii="Times New Roman" w:eastAsia="楷体" w:hAnsi="Times New Roman" w:cs="Times New Roman" w:hint="eastAsia"/>
-          <w:kern w:val="0"/>
-          <w:sz w:val="20"/>
-          <w:szCs w:val="20"/>
-        </w:rPr>
-        <w:t>npj Urban Sustainability</w:t>
-      </w:r>
-      <w:r>
-        <w:rPr>
-          <w:rFonts w:ascii="Times New Roman" w:eastAsia="楷体" w:hAnsi="Times New Roman" w:cs="Times New Roman" w:hint="eastAsia"/>
-          <w:kern w:val="0"/>
-          <w:sz w:val="20"/>
-          <w:szCs w:val="20"/>
-        </w:rPr>
-        <w:t>、</w:t>
-      </w:r>
-      <w:r>
-        <w:rPr>
-          <w:rFonts w:ascii="Times New Roman" w:eastAsia="楷体" w:hAnsi="Times New Roman" w:cs="Times New Roman" w:hint="eastAsia"/>
-          <w:kern w:val="0"/>
-          <w:sz w:val="20"/>
-          <w:szCs w:val="20"/>
-        </w:rPr>
-        <w:t>Earth's Future</w:t>
-      </w:r>
-      <w:r>
-        <w:rPr>
-          <w:rFonts w:ascii="Times New Roman" w:eastAsia="楷体" w:hAnsi="Times New Roman" w:cs="Times New Roman" w:hint="eastAsia"/>
-          <w:kern w:val="0"/>
-          <w:sz w:val="20"/>
-          <w:szCs w:val="20"/>
-        </w:rPr>
-        <w:t>、</w:t>
-      </w:r>
-      <w:r>
-        <w:rPr>
-          <w:rFonts w:ascii="Times New Roman" w:eastAsia="楷体" w:hAnsi="Times New Roman" w:cs="Times New Roman" w:hint="eastAsia"/>
-          <w:kern w:val="0"/>
-          <w:sz w:val="20"/>
-          <w:szCs w:val="20"/>
-        </w:rPr>
-        <w:t>Environmental Impact Assessment Review</w:t>
-      </w:r>
-      <w:r>
-        <w:rPr>
-          <w:rFonts w:ascii="Times New Roman" w:eastAsia="楷体" w:hAnsi="Times New Roman" w:cs="Times New Roman" w:hint="eastAsia"/>
-          <w:kern w:val="0"/>
-          <w:sz w:val="20"/>
-          <w:szCs w:val="20"/>
-        </w:rPr>
-        <w:t>等期刊。</w:t>
+        <w:t>篇，另以第二作者参与5篇论文，均由导师担任第一作者；ESI高被引论文4篇。成果发表于npj Urban Sustainability、Earth's Future、Environmental Impact Assessment Review等期刊。</w:t>
       </w:r>
     </w:p>
     <w:p>
@@ -2533,23 +2407,15 @@
           <w:kern w:val="0"/>
           <w:sz w:val="22"/>
         </w:rPr>
-        <w:t xml:space="preserve">, &amp; Wang, S</w:t>
-      </w:r>
-      <w:r>
-        <w:rPr>
-          <w:rFonts w:ascii="Times New Roman" w:eastAsia="楷体" w:hAnsi="Times New Roman" w:cs="Times New Roman"/>
-          <w:kern w:val="0"/>
-          <w:sz w:val="22"/>
-        </w:rPr>
-        <w:t xml:space="preserve">. (2024). </w:t>
-      </w:r>
-      <w:r>
-        <w:rPr>
-          <w:rFonts w:ascii="Times New Roman" w:eastAsia="楷体" w:hAnsi="Times New Roman" w:cs="Times New Roman"/>
-          <w:kern w:val="0"/>
-          <w:sz w:val="22"/>
-        </w:rPr>
-        <w:t xml:space="preserve">Effectiveness of nature reserves in China: Human footprint and ecosystem services perspective. </w:t>
+        <w:t>*, &amp; Wang, S.*</w:t>
+      </w:r>
+      <w:r>
+        <w:rPr>
+          <w:rFonts w:ascii="Times New Roman" w:eastAsia="楷体" w:hAnsi="Times New Roman" w:cs="Times New Roman"/>
+          <w:kern w:val="0"/>
+          <w:sz w:val="22"/>
+        </w:rPr>
+        <w:t xml:space="preserve"> (2024). Effectiveness of nature reserves in China: Human footprint and ecosystem services perspective. </w:t>
       </w:r>
       <w:r>
         <w:rPr>
@@ -2569,23 +2435,7 @@
           <w:kern w:val="0"/>
           <w:sz w:val="22"/>
         </w:rPr>
-        <w:t xml:space="preserve">, 171, 103359. </w:t>
-      </w:r>
-      <w:r>
-        <w:rPr>
-          <w:rFonts w:ascii="Times New Roman" w:eastAsia="楷体" w:hAnsi="Times New Roman" w:cs="Times New Roman"/>
-          <w:kern w:val="0"/>
-          <w:sz w:val="22"/>
-        </w:rPr>
-        <w:t xml:space="preserve">（共同通讯作者）</w:t>
-      </w:r>
-      <w:r>
-        <w:rPr>
-          <w:rFonts w:ascii="Times New Roman" w:eastAsia="楷体" w:hAnsi="Times New Roman" w:cs="Times New Roman"/>
-          <w:kern w:val="0"/>
-          <w:sz w:val="22"/>
-        </w:rPr>
-        <w:t xml:space="preserve"> </w:t>
+        <w:t xml:space="preserve">, 171, 103359. （共同通讯作者） </w:t>
       </w:r>
       <w:hyperlink r:id="rId17">
         <w:r>
@@ -3034,114 +2884,6 @@
     </w:p>
     <w:p>
       <w:pPr>
-        <w:keepLines/>
-        <w:numPr>
-          <w:ilvl w:val="0"/>
-          <w:numId w:val="41"/>
-        </w:numPr>
-        <w:autoSpaceDE w:val="0"/>
-        <w:autoSpaceDN w:val="0"/>
-        <w:adjustRightInd w:val="0"/>
-        <w:spacing w:before="40" w:line="280" w:lineRule="exact"/>
-        <w:rPr>
-          <w:rFonts w:ascii="Times New Roman" w:eastAsia="楷体" w:hAnsi="Times New Roman" w:cs="Times New Roman"/>
-          <w:kern w:val="0"/>
-          <w:sz w:val="22"/>
-        </w:rPr>
-      </w:pPr>
-      <w:r>
-        <w:rPr>
-          <w:rFonts w:ascii="Times New Roman" w:eastAsia="楷体" w:hAnsi="Times New Roman" w:cs="Times New Roman"/>
-          <w:kern w:val="0"/>
-          <w:sz w:val="22"/>
-        </w:rPr>
-        <w:t xml:space="preserve">Fan, J., Li, K., &amp; </w:t>
-      </w:r>
-      <w:r>
-        <w:rPr>
-          <w:rFonts w:ascii="Times New Roman" w:eastAsia="楷体" w:hAnsi="Times New Roman" w:cs="Times New Roman"/>
-          <w:b/>
-          <w:bCs/>
-          <w:kern w:val="0"/>
-          <w:sz w:val="22"/>
-        </w:rPr>
-        <w:t xml:space="preserve">Gu, T.</w:t>
-      </w:r>
-      <w:r>
-        <w:rPr>
-          <w:rFonts w:ascii="Times New Roman" w:eastAsia="楷体" w:hAnsi="Times New Roman" w:cs="Times New Roman"/>
-          <w:kern w:val="0"/>
-          <w:sz w:val="22"/>
-        </w:rPr>
-        <w:t xml:space="preserve">*</w:t>
-      </w:r>
-      <w:r>
-        <w:rPr>
-          <w:rFonts w:ascii="Times New Roman" w:eastAsia="楷体" w:hAnsi="Times New Roman" w:cs="Times New Roman"/>
-          <w:kern w:val="0"/>
-          <w:sz w:val="22"/>
-        </w:rPr>
-        <w:t xml:space="preserve">. (2026). </w:t>
-      </w:r>
-      <w:r>
-        <w:rPr>
-          <w:rFonts w:ascii="Times New Roman" w:eastAsia="楷体" w:hAnsi="Times New Roman" w:cs="Times New Roman"/>
-          <w:kern w:val="0"/>
-          <w:sz w:val="22"/>
-        </w:rPr>
-        <w:t xml:space="preserve">Landscape character assessment of urban historical and cultural blocks and landscape design for place attachment enhancement-a case study of Sanxuejie Historical and Cultural Block in Xi'an, China. </w:t>
-      </w:r>
-      <w:r>
-        <w:rPr>
-          <w:rFonts w:ascii="Times New Roman" w:eastAsia="楷体" w:hAnsi="Times New Roman" w:cs="Times New Roman"/>
-          <w:b/>
-          <w:bCs/>
-          <w:i/>
-          <w:iCs/>
-          <w:kern w:val="0"/>
-          <w:sz w:val="22"/>
-        </w:rPr>
-        <w:t xml:space="preserve">Journal of Asian Architecture and Building Engineering</w:t>
-      </w:r>
-      <w:r>
-        <w:rPr>
-          <w:rFonts w:ascii="Times New Roman" w:eastAsia="楷体" w:hAnsi="Times New Roman" w:cs="Times New Roman"/>
-          <w:kern w:val="0"/>
-          <w:sz w:val="22"/>
-        </w:rPr>
-        <w:t xml:space="preserve">, 25(4), 3761-3779. </w:t>
-      </w:r>
-      <w:r>
-        <w:rPr>
-          <w:rFonts w:ascii="Times New Roman" w:eastAsia="楷体" w:hAnsi="Times New Roman" w:cs="Times New Roman"/>
-          <w:kern w:val="0"/>
-          <w:sz w:val="22"/>
-        </w:rPr>
-        <w:t xml:space="preserve">（通讯作者）</w:t>
-      </w:r>
-      <w:r>
-        <w:rPr>
-          <w:rFonts w:ascii="Times New Roman" w:eastAsia="楷体" w:hAnsi="Times New Roman" w:cs="Times New Roman"/>
-          <w:kern w:val="0"/>
-          <w:sz w:val="22"/>
-        </w:rPr>
-        <w:t xml:space="preserve"> </w:t>
-      </w:r>
-      <w:hyperlink r:id="rId22">
-        <w:r>
-          <w:rPr>
-            <w:rFonts w:ascii="Times New Roman" w:eastAsia="楷体" w:hAnsi="Times New Roman" w:cs="Times New Roman"/>
-            <w:kern w:val="0"/>
-            <w:sz w:val="22"/>
-            <w:color w:val="004DA3"/>
-            <w:u w:val="single"/>
-          </w:rPr>
-          <w:t xml:space="preserve">DOI: 10.1080/13467581.2025.2510607</w:t>
-        </w:r>
-      </w:hyperlink>
-    </w:p>
-    <w:p>
-      <w:pPr>
         <w:keepNext/>
         <w:autoSpaceDE w:val="0"/>
         <w:autoSpaceDN w:val="0"/>
@@ -6223,6 +5965,98 @@
             <w:u w:val="single"/>
           </w:rPr>
           <w:t xml:space="preserve">DOI: 10.1007/s10661-023-11563-5</w:t>
+        </w:r>
+      </w:hyperlink>
+    </w:p>
+    <w:p>
+      <w:pPr>
+        <w:keepLines/>
+        <w:numPr>
+          <w:ilvl w:val="0"/>
+          <w:numId w:val="41"/>
+        </w:numPr>
+        <w:autoSpaceDE w:val="0"/>
+        <w:autoSpaceDN w:val="0"/>
+        <w:adjustRightInd w:val="0"/>
+        <w:spacing w:before="40" w:line="280" w:lineRule="exact"/>
+        <w:rPr>
+          <w:rFonts w:ascii="Times New Roman" w:eastAsia="楷体" w:hAnsi="Times New Roman" w:cs="Times New Roman"/>
+          <w:kern w:val="0"/>
+          <w:sz w:val="22"/>
+        </w:rPr>
+      </w:pPr>
+      <w:r>
+        <w:rPr>
+          <w:rFonts w:ascii="Times New Roman" w:eastAsia="楷体" w:hAnsi="Times New Roman" w:cs="Times New Roman"/>
+          <w:kern w:val="0"/>
+          <w:sz w:val="22"/>
+        </w:rPr>
+        <w:t xml:space="preserve">Fan, J., Li, K., &amp; </w:t>
+      </w:r>
+      <w:r>
+        <w:rPr>
+          <w:rFonts w:ascii="Times New Roman" w:eastAsia="楷体" w:hAnsi="Times New Roman" w:cs="Times New Roman"/>
+          <w:b/>
+          <w:bCs/>
+          <w:kern w:val="0"/>
+          <w:sz w:val="22"/>
+        </w:rPr>
+        <w:t xml:space="preserve">Gu, T.</w:t>
+      </w:r>
+      <w:r>
+        <w:rPr>
+          <w:rFonts w:ascii="Times New Roman" w:eastAsia="楷体" w:hAnsi="Times New Roman" w:cs="Times New Roman"/>
+          <w:kern w:val="0"/>
+          <w:sz w:val="22"/>
+        </w:rPr>
+        <w:t xml:space="preserve"> (2026). Landscape character assessment of urban historical and cultural blocks and landscape design for place attachment enhancement-a case study of Sanxuejie Historical and Cultural Block in Xi'an, China. </w:t>
+      </w:r>
+      <w:r>
+        <w:rPr>
+          <w:rFonts w:ascii="Times New Roman" w:eastAsia="楷体" w:hAnsi="Times New Roman" w:cs="Times New Roman"/>
+          <w:b/>
+          <w:bCs/>
+          <w:i/>
+          <w:iCs/>
+          <w:kern w:val="0"/>
+          <w:sz w:val="22"/>
+        </w:rPr>
+        <w:t xml:space="preserve">Journal of Asian Architecture and Building Engineering</w:t>
+      </w:r>
+      <w:r>
+        <w:rPr>
+          <w:rFonts w:ascii="Times New Roman" w:eastAsia="楷体" w:hAnsi="Times New Roman" w:cs="Times New Roman"/>
+          <w:kern w:val="0"/>
+          <w:sz w:val="22"/>
+        </w:rPr>
+        <w:t xml:space="preserve">, 25(4), 3761-3779. （</w:t>
+      </w:r>
+      <w:r>
+        <w:rPr>
+          <w:rFonts w:ascii="Times New Roman" w:eastAsia="楷体" w:hAnsi="Times New Roman" w:cs="Times New Roman"/>
+          <w:kern w:val="0"/>
+          <w:sz w:val="22"/>
+        </w:rPr>
+        <w:t>合作</w:t>
+      </w:r>
+      <w:r>
+        <w:rPr>
+          <w:rFonts w:ascii="Times New Roman" w:eastAsia="楷体" w:hAnsi="Times New Roman" w:cs="Times New Roman"/>
+          <w:kern w:val="0"/>
+          <w:sz w:val="22"/>
+        </w:rPr>
+        <w:t xml:space="preserve">作者） </w:t>
+      </w:r>
+      <w:hyperlink r:id="rId22">
+        <w:r>
+          <w:rPr>
+            <w:rFonts w:ascii="Times New Roman" w:eastAsia="楷体" w:hAnsi="Times New Roman" w:cs="Times New Roman"/>
+            <w:kern w:val="0"/>
+            <w:sz w:val="22"/>
+            <w:color w:val="004DA3"/>
+            <w:u w:val="single"/>
+          </w:rPr>
+          <w:t xml:space="preserve">DOI: 10.1080/13467581.2025.2510607</w:t>
         </w:r>
       </w:hyperlink>
     </w:p>

</xml_diff>

<commit_message>
feat(awards): add three 2026 doctoral honors
</commit_message>
<xml_diff>
--- a/assets/tianci-gu-cv.docx
+++ b/assets/tianci-gu-cv.docx
@@ -8821,59 +8821,7 @@
           <w:sz w:val="18"/>
           <w:szCs w:val="18"/>
         </w:rPr>
-        <w:t xml:space="preserve">1. 2026</w:t>
-      </w:r>
-      <w:r>
-        <w:rPr>
-          <w:rFonts w:ascii="Times New Roman" w:eastAsia="楷体" w:hAnsi="Times New Roman" w:cs="STKaitiSC-Regular" w:hint="eastAsia"/>
-          <w:kern w:val="0"/>
-          <w:sz w:val="18"/>
-          <w:szCs w:val="18"/>
-        </w:rPr>
-        <w:t xml:space="preserve">年 国家留学基金委</w:t>
-      </w:r>
-      <w:r>
-        <w:rPr>
-          <w:rFonts w:ascii="Times New Roman" w:eastAsia="楷体" w:hAnsi="Times New Roman" w:cs="STKaitiSC-Regular" w:hint="eastAsia"/>
-          <w:kern w:val="0"/>
-          <w:sz w:val="18"/>
-          <w:szCs w:val="18"/>
-        </w:rPr>
-        <w:t xml:space="preserve"/>
-      </w:r>
-      <w:r>
-        <w:rPr>
-          <w:rFonts w:ascii="Times New Roman" w:eastAsia="楷体" w:hAnsi="Times New Roman" w:cs="STKaitiSC-Regular" w:hint="eastAsia"/>
-          <w:kern w:val="0"/>
-          <w:sz w:val="18"/>
-          <w:szCs w:val="18"/>
-        </w:rPr>
-        <w:t xml:space="preserve">国家公派留学资助</w:t>
-      </w:r>
-      <w:r>
-        <w:rPr>
-          <w:rFonts w:ascii="Times New Roman" w:eastAsia="楷体" w:hAnsi="Times New Roman" w:cs="STKaitiSC-Regular" w:hint="eastAsia"/>
-          <w:kern w:val="0"/>
-          <w:sz w:val="18"/>
-          <w:szCs w:val="18"/>
-        </w:rPr>
-      </w:r>
-      <w:r>
-        <w:rPr>
-          <w:rFonts w:ascii="Times New Roman" w:eastAsia="楷体" w:hAnsi="Times New Roman" w:cs="STKaitiSC-Regular" w:hint="eastAsia"/>
-          <w:kern w:val="0"/>
-          <w:sz w:val="18"/>
-          <w:szCs w:val="18"/>
-        </w:rPr>
-      </w:r>
-      <w:r>
-        <w:rPr>
-          <w:rFonts w:ascii="Times New Roman" w:eastAsia="楷体" w:hAnsi="Times New Roman" w:cs="STKaitiSC-Regular" w:hint="eastAsia"/>
-          <w:kern w:val="0"/>
-          <w:sz w:val="18"/>
-          <w:szCs w:val="18"/>
-        </w:rPr>
-        <w:t xml:space="preserve"/>
+        <w:t>1. 2026年 入选中国科协青年科技人才培育工程博士生专项计划（由中国自然资源学会培育）</w:t>
       </w:r>
     </w:p>
     <w:p>
@@ -8896,7 +8844,7 @@
           <w:sz w:val="18"/>
           <w:szCs w:val="18"/>
         </w:rPr>
-        <w:t xml:space="preserve">2. 2025</w:t>
+        <w:t>2</w:t>
       </w:r>
       <w:r>
         <w:rPr>
@@ -8905,66 +8853,7 @@
           <w:sz w:val="18"/>
           <w:szCs w:val="18"/>
         </w:rPr>
-        <w:t xml:space="preserve">年 北京师范大学“京师先锋党员”</w:t>
-      </w:r>
-      <w:r>
-        <w:rPr>
-          <w:rFonts w:ascii="Times New Roman" w:eastAsia="楷体" w:hAnsi="Times New Roman" w:cs="STKaitiSC-Regular" w:hint="eastAsia"/>
-          <w:kern w:val="0"/>
-          <w:sz w:val="18"/>
-          <w:szCs w:val="18"/>
-        </w:rPr>
-      </w:r>
-      <w:r>
-        <w:rPr>
-          <w:rFonts w:ascii="Times New Roman" w:eastAsia="楷体" w:hAnsi="Times New Roman" w:cs="STKaitiSC-Regular" w:hint="eastAsia"/>
-          <w:kern w:val="0"/>
-          <w:sz w:val="18"/>
-          <w:szCs w:val="18"/>
-        </w:rPr>
-      </w:r>
-      <w:r>
-        <w:rPr>
-          <w:rFonts w:ascii="Times New Roman" w:eastAsia="楷体" w:hAnsi="Times New Roman" w:cs="STKaitiSC-Regular" w:hint="eastAsia"/>
-          <w:kern w:val="0"/>
-          <w:sz w:val="18"/>
-          <w:szCs w:val="18"/>
-        </w:rPr>
-      </w:r>
-      <w:r>
-        <w:rPr>
-          <w:rFonts w:ascii="Times New Roman" w:eastAsia="楷体" w:hAnsi="Times New Roman" w:cs="STKaitiSC-Regular" w:hint="eastAsia"/>
-          <w:kern w:val="0"/>
-          <w:sz w:val="18"/>
-          <w:szCs w:val="18"/>
-        </w:rPr>
-      </w:r>
-      <w:r>
-        <w:rPr>
-          <w:rFonts w:ascii="Times New Roman" w:eastAsia="楷体" w:hAnsi="Times New Roman" w:cs="STKaitiSC-Regular" w:hint="eastAsia"/>
-          <w:kern w:val="0"/>
-          <w:sz w:val="18"/>
-          <w:szCs w:val="18"/>
-        </w:rPr>
-        <w:t xml:space="preserve"/>
-      </w:r>
-      <w:r>
-        <w:rPr>
-          <w:rFonts w:ascii="Times New Roman" w:eastAsia="楷体" w:hAnsi="Times New Roman" w:cs="STKaitiSC-Regular" w:hint="eastAsia"/>
-          <w:kern w:val="0"/>
-          <w:sz w:val="18"/>
-          <w:szCs w:val="18"/>
-        </w:rPr>
-        <w:t xml:space="preserve"/>
-      </w:r>
-      <w:r>
-        <w:rPr>
-          <w:rFonts w:ascii="Times New Roman" w:eastAsia="楷体" w:hAnsi="Times New Roman" w:cs="STKaitiSC-Regular" w:hint="eastAsia"/>
-          <w:kern w:val="0"/>
-          <w:sz w:val="18"/>
-          <w:szCs w:val="18"/>
-        </w:rPr>
-        <w:t xml:space="preserve"/>
+        <w:t>. 2026年 国家留学基金委国家公派留学资助</w:t>
       </w:r>
     </w:p>
     <w:p>
@@ -8987,75 +8876,7 @@
           <w:sz w:val="18"/>
           <w:szCs w:val="18"/>
         </w:rPr>
-        <w:t xml:space="preserve">3. 2025</w:t>
-      </w:r>
-      <w:r>
-        <w:rPr>
-          <w:rFonts w:ascii="Times New Roman" w:eastAsia="楷体" w:hAnsi="Times New Roman" w:cs="STKaitiSC-Regular" w:hint="eastAsia"/>
-          <w:kern w:val="0"/>
-          <w:sz w:val="18"/>
-          <w:szCs w:val="18"/>
-        </w:rPr>
-        <w:t xml:space="preserve">年 北京师范大学博士研究生学业一等奖学金</w:t>
-      </w:r>
-      <w:r>
-        <w:rPr>
-          <w:rFonts w:ascii="Times New Roman" w:eastAsia="楷体" w:hAnsi="Times New Roman" w:cs="STKaitiSC-Regular" w:hint="eastAsia"/>
-          <w:kern w:val="0"/>
-          <w:sz w:val="18"/>
-          <w:szCs w:val="18"/>
-        </w:rPr>
-      </w:r>
-      <w:r>
-        <w:rPr>
-          <w:rFonts w:ascii="Times New Roman" w:eastAsia="楷体" w:hAnsi="Times New Roman" w:cs="STKaitiSC-Regular" w:hint="eastAsia"/>
-          <w:kern w:val="0"/>
-          <w:sz w:val="18"/>
-          <w:szCs w:val="18"/>
-        </w:rPr>
-      </w:r>
-      <w:r>
-        <w:rPr>
-          <w:rFonts w:ascii="Times New Roman" w:eastAsia="楷体" w:hAnsi="Times New Roman" w:cs="STKaitiSC-Regular" w:hint="eastAsia"/>
-          <w:kern w:val="0"/>
-          <w:sz w:val="18"/>
-          <w:szCs w:val="18"/>
-        </w:rPr>
-      </w:r>
-      <w:r>
-        <w:rPr>
-          <w:rFonts w:ascii="Times New Roman" w:eastAsia="楷体" w:hAnsi="Times New Roman" w:cs="STKaitiSC-Regular" w:hint="eastAsia"/>
-          <w:kern w:val="0"/>
-          <w:sz w:val="18"/>
-          <w:szCs w:val="18"/>
-        </w:rPr>
-      </w:r>
-      <w:r>
-        <w:rPr>
-          <w:rFonts w:ascii="Times New Roman" w:eastAsia="楷体" w:hAnsi="Times New Roman" w:cs="STKaitiSC-Regular" w:hint="eastAsia"/>
-          <w:kern w:val="0"/>
-          <w:sz w:val="18"/>
-          <w:szCs w:val="18"/>
-        </w:rPr>
-        <w:t xml:space="preserve"/>
-      </w:r>
-      <w:r>
-        <w:rPr>
-          <w:rFonts w:ascii="Times New Roman" w:eastAsia="楷体" w:hAnsi="Times New Roman" w:cs="STKaitiSC-Regular" w:hint="eastAsia"/>
-          <w:kern w:val="0"/>
-          <w:sz w:val="18"/>
-          <w:szCs w:val="18"/>
-        </w:rPr>
-        <w:t xml:space="preserve"/>
-      </w:r>
-      <w:r>
-        <w:rPr>
-          <w:rFonts w:ascii="Times New Roman" w:eastAsia="楷体" w:hAnsi="Times New Roman" w:cs="STKaitiSC-Regular" w:hint="eastAsia"/>
-          <w:kern w:val="0"/>
-          <w:sz w:val="18"/>
-          <w:szCs w:val="18"/>
-        </w:rPr>
-        <w:t xml:space="preserve"/>
+        <w:t>3. 2026年 北京师范大学博士研究生学业一等奖学金</w:t>
       </w:r>
     </w:p>
     <w:p>
@@ -9078,41 +8899,7 @@
           <w:sz w:val="18"/>
           <w:szCs w:val="18"/>
         </w:rPr>
-        <w:t xml:space="preserve">4. 2026</w:t>
-      </w:r>
-      <w:r>
-        <w:rPr>
-          <w:rFonts w:ascii="Times New Roman" w:eastAsia="楷体" w:hAnsi="Times New Roman" w:cs="STKaitiSC-Regular" w:hint="eastAsia"/>
-          <w:kern w:val="0"/>
-          <w:sz w:val="18"/>
-          <w:szCs w:val="18"/>
-        </w:rPr>
-        <w:t xml:space="preserve">年 中国自然资源科学大会论文报告精选</w:t>
-      </w:r>
-      <w:r>
-        <w:rPr>
-          <w:rFonts w:ascii="Times New Roman" w:eastAsia="楷体" w:hAnsi="Times New Roman" w:cs="STKaitiSC-Regular" w:hint="eastAsia"/>
-          <w:kern w:val="0"/>
-          <w:sz w:val="18"/>
-          <w:szCs w:val="18"/>
-        </w:rPr>
-      </w:r>
-      <w:r>
-        <w:rPr>
-          <w:rFonts w:ascii="Times New Roman" w:eastAsia="楷体" w:hAnsi="Times New Roman" w:cs="STKaitiSC-Regular" w:hint="eastAsia"/>
-          <w:kern w:val="0"/>
-          <w:sz w:val="18"/>
-          <w:szCs w:val="18"/>
-        </w:rPr>
-      </w:r>
-      <w:r>
-        <w:rPr>
-          <w:rFonts w:ascii="Times New Roman" w:eastAsia="楷体" w:hAnsi="Times New Roman" w:cs="STKaitiSC-Regular" w:hint="eastAsia"/>
-          <w:kern w:val="0"/>
-          <w:sz w:val="18"/>
-          <w:szCs w:val="18"/>
-        </w:rPr>
-        <w:t xml:space="preserve"/>
+        <w:t>4. 2026年 北京师范大学三好学生</w:t>
       </w:r>
     </w:p>
     <w:p>
@@ -9135,7 +8922,7 @@
           <w:sz w:val="18"/>
           <w:szCs w:val="18"/>
         </w:rPr>
-        <w:t xml:space="preserve">5. 2026</w:t>
+        <w:t>5</w:t>
       </w:r>
       <w:r>
         <w:rPr>
@@ -9144,32 +8931,7 @@
           <w:sz w:val="18"/>
           <w:szCs w:val="18"/>
         </w:rPr>
-        <w:t xml:space="preserve">年 北京师范大学地理科学学部“光影里的春分”摄影比赛一等奖</w:t>
-      </w:r>
-      <w:r>
-        <w:rPr>
-          <w:rFonts w:ascii="Times New Roman" w:eastAsia="楷体" w:hAnsi="Times New Roman" w:cs="STKaitiSC-Regular" w:hint="eastAsia"/>
-          <w:kern w:val="0"/>
-          <w:sz w:val="18"/>
-          <w:szCs w:val="18"/>
-        </w:rPr>
-      </w:r>
-      <w:r>
-        <w:rPr>
-          <w:rFonts w:ascii="Times New Roman" w:eastAsia="楷体" w:hAnsi="Times New Roman" w:cs="STKaitiSC-Regular" w:hint="eastAsia"/>
-          <w:kern w:val="0"/>
-          <w:sz w:val="18"/>
-          <w:szCs w:val="18"/>
-        </w:rPr>
-      </w:r>
-      <w:r>
-        <w:rPr>
-          <w:rFonts w:ascii="Times New Roman" w:eastAsia="楷体" w:hAnsi="Times New Roman" w:cs="STKaitiSC-Regular" w:hint="eastAsia"/>
-          <w:kern w:val="0"/>
-          <w:sz w:val="18"/>
-          <w:szCs w:val="18"/>
-        </w:rPr>
-        <w:t xml:space="preserve"/>
+        <w:t>. 2025年 北京师范大学“京师先锋党员”</w:t>
       </w:r>
     </w:p>
     <w:p>
@@ -9192,7 +8954,7 @@
           <w:sz w:val="18"/>
           <w:szCs w:val="18"/>
         </w:rPr>
-        <w:t xml:space="preserve">6. 2025</w:t>
+        <w:t>6</w:t>
       </w:r>
       <w:r>
         <w:rPr>
@@ -9201,42 +8963,7 @@
           <w:sz w:val="18"/>
           <w:szCs w:val="18"/>
         </w:rPr>
-        <w:t xml:space="preserve">年 北京师范大学地理科学学部自然资源学院第九届研究生学术能力竞赛二等奖</w:t>
-      </w:r>
-      <w:r>
-        <w:rPr>
-          <w:rFonts w:ascii="Times New Roman" w:eastAsia="楷体" w:hAnsi="Times New Roman" w:cs="STKaitiSC-Regular" w:hint="eastAsia"/>
-          <w:kern w:val="0"/>
-          <w:sz w:val="18"/>
-          <w:szCs w:val="18"/>
-        </w:rPr>
-      </w:r>
-      <w:r>
-        <w:rPr>
-          <w:rFonts w:ascii="Times New Roman" w:eastAsia="楷体" w:hAnsi="Times New Roman" w:cs="STKaitiSC-Regular" w:hint="eastAsia"/>
-          <w:kern w:val="0"/>
-          <w:sz w:val="18"/>
-          <w:szCs w:val="18"/>
-        </w:rPr>
-        <w:t xml:space="preserve"/>
-      </w:r>
-      <w:r>
-        <w:rPr>
-          <w:rFonts w:ascii="Times New Roman" w:eastAsia="楷体" w:hAnsi="Times New Roman" w:cs="STKaitiSC-Regular" w:hint="eastAsia"/>
-          <w:kern w:val="0"/>
-          <w:sz w:val="18"/>
-          <w:szCs w:val="18"/>
-        </w:rPr>
-        <w:t xml:space="preserve"/>
-      </w:r>
-      <w:r>
-        <w:rPr>
-          <w:rFonts w:ascii="Times New Roman" w:eastAsia="楷体" w:hAnsi="Times New Roman" w:cs="STKaitiSC-Regular" w:hint="eastAsia"/>
-          <w:kern w:val="0"/>
-          <w:sz w:val="18"/>
-          <w:szCs w:val="18"/>
-        </w:rPr>
-        <w:t xml:space="preserve"/>
+        <w:t>. 2025年 北京师范大学博士研究生学业一等奖学金</w:t>
       </w:r>
     </w:p>
     <w:p>
@@ -9268,8 +8995,7 @@
           <w:sz w:val="18"/>
           <w:szCs w:val="18"/>
         </w:rPr>
-        <w:t xml:space="preserve">. 2025年 北京师范大学地理科学学部学术年会优秀报告一等奖</w:t>
-        <w:t xml:space="preserve"/>
+        <w:t>. 2026年 中国自然资源科学大会论文报告精选</w:t>
       </w:r>
     </w:p>
     <w:p>
@@ -9301,8 +9027,7 @@
           <w:sz w:val="18"/>
           <w:szCs w:val="18"/>
         </w:rPr>
-        <w:t xml:space="preserve">. 2025年 北京师范大学地理科学学部第五届微党课大赛一等奖</w:t>
-        <w:t xml:space="preserve"/>
+        <w:t>. 2026年 北京师范大学地理科学学部“光影里的春分”摄影比赛一等奖</w:t>
       </w:r>
     </w:p>
     <w:p>
@@ -9334,8 +9059,103 @@
           <w:sz w:val="18"/>
           <w:szCs w:val="18"/>
         </w:rPr>
-        <w:t xml:space="preserve">. 2024年 北京师范大学地理科学学部学术年会优秀报告二等奖</w:t>
-        <w:t xml:space="preserve"/>
+        <w:t>. 2025年 北京师范大学地理科学学部自然资源学院第九届研究生学术能力竞赛二等奖</w:t>
+      </w:r>
+    </w:p>
+    <w:p>
+      <w:pPr>
+        <w:autoSpaceDE w:val="0"/>
+        <w:autoSpaceDN w:val="0"/>
+        <w:adjustRightInd w:val="0"/>
+        <w:spacing w:before="20" w:line="240" w:lineRule="exact"/>
+        <w:rPr>
+          <w:rFonts w:ascii="Times New Roman" w:eastAsia="楷体" w:hAnsi="Times New Roman" w:cs="STKaitiSC-Regular"/>
+          <w:kern w:val="0"/>
+          <w:sz w:val="18"/>
+          <w:szCs w:val="18"/>
+        </w:rPr>
+      </w:pPr>
+      <w:r>
+        <w:rPr>
+          <w:rFonts w:ascii="Times New Roman" w:eastAsia="楷体" w:hAnsi="Times New Roman" w:cs="STKaitiSC-Regular" w:hint="eastAsia"/>
+          <w:kern w:val="0"/>
+          <w:sz w:val="18"/>
+          <w:szCs w:val="18"/>
+        </w:rPr>
+        <w:t>10</w:t>
+      </w:r>
+      <w:r>
+        <w:rPr>
+          <w:rFonts w:ascii="Times New Roman" w:eastAsia="楷体" w:hAnsi="Times New Roman" w:cs="STKaitiSC-Regular" w:hint="eastAsia"/>
+          <w:kern w:val="0"/>
+          <w:sz w:val="18"/>
+          <w:szCs w:val="18"/>
+        </w:rPr>
+        <w:t>. 2025年 北京师范大学地理科学学部学术年会优秀报告一等奖</w:t>
+      </w:r>
+    </w:p>
+    <w:p>
+      <w:pPr>
+        <w:autoSpaceDE w:val="0"/>
+        <w:autoSpaceDN w:val="0"/>
+        <w:adjustRightInd w:val="0"/>
+        <w:spacing w:before="20" w:line="240" w:lineRule="exact"/>
+        <w:rPr>
+          <w:rFonts w:ascii="Times New Roman" w:eastAsia="楷体" w:hAnsi="Times New Roman" w:cs="STKaitiSC-Regular"/>
+          <w:kern w:val="0"/>
+          <w:sz w:val="18"/>
+          <w:szCs w:val="18"/>
+        </w:rPr>
+      </w:pPr>
+      <w:r>
+        <w:rPr>
+          <w:rFonts w:ascii="Times New Roman" w:eastAsia="楷体" w:hAnsi="Times New Roman" w:cs="STKaitiSC-Regular" w:hint="eastAsia"/>
+          <w:kern w:val="0"/>
+          <w:sz w:val="18"/>
+          <w:szCs w:val="18"/>
+        </w:rPr>
+        <w:t>11</w:t>
+      </w:r>
+      <w:r>
+        <w:rPr>
+          <w:rFonts w:ascii="Times New Roman" w:eastAsia="楷体" w:hAnsi="Times New Roman" w:cs="STKaitiSC-Regular" w:hint="eastAsia"/>
+          <w:kern w:val="0"/>
+          <w:sz w:val="18"/>
+          <w:szCs w:val="18"/>
+        </w:rPr>
+        <w:t>. 2025年 北京师范大学地理科学学部第五届微党课大赛一等奖</w:t>
+      </w:r>
+    </w:p>
+    <w:p>
+      <w:pPr>
+        <w:autoSpaceDE w:val="0"/>
+        <w:autoSpaceDN w:val="0"/>
+        <w:adjustRightInd w:val="0"/>
+        <w:spacing w:before="20" w:line="240" w:lineRule="exact"/>
+        <w:rPr>
+          <w:rFonts w:ascii="Times New Roman" w:eastAsia="楷体" w:hAnsi="Times New Roman" w:cs="STKaitiSC-Regular"/>
+          <w:kern w:val="0"/>
+          <w:sz w:val="18"/>
+          <w:szCs w:val="18"/>
+        </w:rPr>
+      </w:pPr>
+      <w:r>
+        <w:rPr>
+          <w:rFonts w:ascii="Times New Roman" w:eastAsia="楷体" w:hAnsi="Times New Roman" w:cs="STKaitiSC-Regular" w:hint="eastAsia"/>
+          <w:kern w:val="0"/>
+          <w:sz w:val="18"/>
+          <w:szCs w:val="18"/>
+        </w:rPr>
+        <w:t>12</w:t>
+      </w:r>
+      <w:r>
+        <w:rPr>
+          <w:rFonts w:ascii="Times New Roman" w:eastAsia="楷体" w:hAnsi="Times New Roman" w:cs="STKaitiSC-Regular" w:hint="eastAsia"/>
+          <w:kern w:val="0"/>
+          <w:sz w:val="18"/>
+          <w:szCs w:val="18"/>
+        </w:rPr>
+        <w:t>. 2024年 北京师范大学地理科学学部学术年会优秀报告二等奖</w:t>
       </w:r>
     </w:p>
     <w:p>

</xml_diff>